<commit_message>
Šiek tiek pasiaiškinau apie cookies ir pakeičia login/error path į '/'
</commit_message>
<xml_diff>
--- a/MonkeyRacer_Ataskaita (1).docx
+++ b/MonkeyRacer_Ataskaita (1).docx
@@ -219,7 +219,21 @@
           <w:color w:val="666666"/>
           <w:lang w:val="lt-LT"/>
         </w:rPr>
-        <w:t>2025 m.</w:t>
+        <w:t>202</w:t>
+      </w:r>
+      <w:r>
+        <w:rPr>
+          <w:color w:val="666666"/>
+          <w:lang w:val="lt-LT"/>
+        </w:rPr>
+        <w:t>6</w:t>
+      </w:r>
+      <w:r>
+        <w:rPr>
+          <w:color w:val="666666"/>
+          <w:lang w:val="lt-LT"/>
+        </w:rPr>
+        <w:t xml:space="preserve"> m.</w:t>
       </w:r>
     </w:p>
     <w:p>
@@ -578,12 +592,6 @@
         <w:gridCol w:w="3126"/>
       </w:tblGrid>
       <w:tr>
-        <w:tblPrEx>
-          <w:tblCellMar>
-            <w:top w:w="0" w:type="dxa"/>
-            <w:bottom w:w="0" w:type="dxa"/>
-          </w:tblCellMar>
-        </w:tblPrEx>
         <w:trPr>
           <w:tblHeader/>
         </w:trPr>
@@ -700,12 +708,6 @@
         </w:tc>
       </w:tr>
       <w:tr>
-        <w:tblPrEx>
-          <w:tblCellMar>
-            <w:top w:w="0" w:type="dxa"/>
-            <w:bottom w:w="0" w:type="dxa"/>
-          </w:tblCellMar>
-        </w:tblPrEx>
         <w:tc>
           <w:tcPr>
             <w:tcW w:w="2200" w:type="dxa"/>
@@ -865,12 +867,6 @@
         </w:tc>
       </w:tr>
       <w:tr>
-        <w:tblPrEx>
-          <w:tblCellMar>
-            <w:top w:w="0" w:type="dxa"/>
-            <w:bottom w:w="0" w:type="dxa"/>
-          </w:tblCellMar>
-        </w:tblPrEx>
         <w:tc>
           <w:tcPr>
             <w:tcW w:w="2200" w:type="dxa"/>
@@ -994,12 +990,6 @@
         </w:tc>
       </w:tr>
       <w:tr>
-        <w:tblPrEx>
-          <w:tblCellMar>
-            <w:top w:w="0" w:type="dxa"/>
-            <w:bottom w:w="0" w:type="dxa"/>
-          </w:tblCellMar>
-        </w:tblPrEx>
         <w:tc>
           <w:tcPr>
             <w:tcW w:w="2200" w:type="dxa"/>
@@ -1141,12 +1131,6 @@
         </w:tc>
       </w:tr>
       <w:tr>
-        <w:tblPrEx>
-          <w:tblCellMar>
-            <w:top w:w="0" w:type="dxa"/>
-            <w:bottom w:w="0" w:type="dxa"/>
-          </w:tblCellMar>
-        </w:tblPrEx>
         <w:tc>
           <w:tcPr>
             <w:tcW w:w="2200" w:type="dxa"/>
@@ -1252,12 +1236,6 @@
         </w:tc>
       </w:tr>
       <w:tr>
-        <w:tblPrEx>
-          <w:tblCellMar>
-            <w:top w:w="0" w:type="dxa"/>
-            <w:bottom w:w="0" w:type="dxa"/>
-          </w:tblCellMar>
-        </w:tblPrEx>
         <w:tc>
           <w:tcPr>
             <w:tcW w:w="2200" w:type="dxa"/>
@@ -1391,12 +1369,6 @@
         </w:tc>
       </w:tr>
       <w:tr>
-        <w:tblPrEx>
-          <w:tblCellMar>
-            <w:top w:w="0" w:type="dxa"/>
-            <w:bottom w:w="0" w:type="dxa"/>
-          </w:tblCellMar>
-        </w:tblPrEx>
         <w:tc>
           <w:tcPr>
             <w:tcW w:w="2200" w:type="dxa"/>
@@ -2630,12 +2602,6 @@
         <w:gridCol w:w="3326"/>
       </w:tblGrid>
       <w:tr>
-        <w:tblPrEx>
-          <w:tblCellMar>
-            <w:top w:w="0" w:type="dxa"/>
-            <w:bottom w:w="0" w:type="dxa"/>
-          </w:tblCellMar>
-        </w:tblPrEx>
         <w:trPr>
           <w:tblHeader/>
         </w:trPr>
@@ -2752,12 +2718,6 @@
         </w:tc>
       </w:tr>
       <w:tr>
-        <w:tblPrEx>
-          <w:tblCellMar>
-            <w:top w:w="0" w:type="dxa"/>
-            <w:bottom w:w="0" w:type="dxa"/>
-          </w:tblCellMar>
-        </w:tblPrEx>
         <w:tc>
           <w:tcPr>
             <w:tcW w:w="2000" w:type="dxa"/>
@@ -2935,12 +2895,6 @@
         </w:tc>
       </w:tr>
       <w:tr>
-        <w:tblPrEx>
-          <w:tblCellMar>
-            <w:top w:w="0" w:type="dxa"/>
-            <w:bottom w:w="0" w:type="dxa"/>
-          </w:tblCellMar>
-        </w:tblPrEx>
         <w:tc>
           <w:tcPr>
             <w:tcW w:w="2000" w:type="dxa"/>
@@ -3100,12 +3054,6 @@
         </w:tc>
       </w:tr>
       <w:tr>
-        <w:tblPrEx>
-          <w:tblCellMar>
-            <w:top w:w="0" w:type="dxa"/>
-            <w:bottom w:w="0" w:type="dxa"/>
-          </w:tblCellMar>
-        </w:tblPrEx>
         <w:tc>
           <w:tcPr>
             <w:tcW w:w="2000" w:type="dxa"/>
@@ -3273,12 +3221,6 @@
         </w:tc>
       </w:tr>
       <w:tr>
-        <w:tblPrEx>
-          <w:tblCellMar>
-            <w:top w:w="0" w:type="dxa"/>
-            <w:bottom w:w="0" w:type="dxa"/>
-          </w:tblCellMar>
-        </w:tblPrEx>
         <w:tc>
           <w:tcPr>
             <w:tcW w:w="2000" w:type="dxa"/>
@@ -6872,12 +6814,6 @@
         <w:gridCol w:w="3826"/>
       </w:tblGrid>
       <w:tr>
-        <w:tblPrEx>
-          <w:tblCellMar>
-            <w:top w:w="0" w:type="dxa"/>
-            <w:bottom w:w="0" w:type="dxa"/>
-          </w:tblCellMar>
-        </w:tblPrEx>
         <w:trPr>
           <w:tblHeader/>
         </w:trPr>
@@ -7020,12 +6956,6 @@
         </w:tc>
       </w:tr>
       <w:tr>
-        <w:tblPrEx>
-          <w:tblCellMar>
-            <w:top w:w="0" w:type="dxa"/>
-            <w:bottom w:w="0" w:type="dxa"/>
-          </w:tblCellMar>
-        </w:tblPrEx>
         <w:tc>
           <w:tcPr>
             <w:tcW w:w="2000" w:type="dxa"/>
@@ -7193,12 +7123,6 @@
         </w:tc>
       </w:tr>
       <w:tr>
-        <w:tblPrEx>
-          <w:tblCellMar>
-            <w:top w:w="0" w:type="dxa"/>
-            <w:bottom w:w="0" w:type="dxa"/>
-          </w:tblCellMar>
-        </w:tblPrEx>
         <w:tc>
           <w:tcPr>
             <w:tcW w:w="2000" w:type="dxa"/>
@@ -7338,12 +7262,6 @@
         </w:tc>
       </w:tr>
       <w:tr>
-        <w:tblPrEx>
-          <w:tblCellMar>
-            <w:top w:w="0" w:type="dxa"/>
-            <w:bottom w:w="0" w:type="dxa"/>
-          </w:tblCellMar>
-        </w:tblPrEx>
         <w:tc>
           <w:tcPr>
             <w:tcW w:w="2000" w:type="dxa"/>
@@ -7483,12 +7401,6 @@
         </w:tc>
       </w:tr>
       <w:tr>
-        <w:tblPrEx>
-          <w:tblCellMar>
-            <w:top w:w="0" w:type="dxa"/>
-            <w:bottom w:w="0" w:type="dxa"/>
-          </w:tblCellMar>
-        </w:tblPrEx>
         <w:tc>
           <w:tcPr>
             <w:tcW w:w="2000" w:type="dxa"/>
@@ -7664,12 +7576,6 @@
         </w:tc>
       </w:tr>
       <w:tr>
-        <w:tblPrEx>
-          <w:tblCellMar>
-            <w:top w:w="0" w:type="dxa"/>
-            <w:bottom w:w="0" w:type="dxa"/>
-          </w:tblCellMar>
-        </w:tblPrEx>
         <w:tc>
           <w:tcPr>
             <w:tcW w:w="2000" w:type="dxa"/>
@@ -7881,12 +7787,6 @@
         </w:tc>
       </w:tr>
       <w:tr>
-        <w:tblPrEx>
-          <w:tblCellMar>
-            <w:top w:w="0" w:type="dxa"/>
-            <w:bottom w:w="0" w:type="dxa"/>
-          </w:tblCellMar>
-        </w:tblPrEx>
         <w:tc>
           <w:tcPr>
             <w:tcW w:w="2000" w:type="dxa"/>
@@ -8028,12 +7928,6 @@
         </w:tc>
       </w:tr>
       <w:tr>
-        <w:tblPrEx>
-          <w:tblCellMar>
-            <w:top w:w="0" w:type="dxa"/>
-            <w:bottom w:w="0" w:type="dxa"/>
-          </w:tblCellMar>
-        </w:tblPrEx>
         <w:tc>
           <w:tcPr>
             <w:tcW w:w="2000" w:type="dxa"/>
@@ -8646,12 +8540,6 @@
         <w:gridCol w:w="3326"/>
       </w:tblGrid>
       <w:tr>
-        <w:tblPrEx>
-          <w:tblCellMar>
-            <w:top w:w="0" w:type="dxa"/>
-            <w:bottom w:w="0" w:type="dxa"/>
-          </w:tblCellMar>
-        </w:tblPrEx>
         <w:trPr>
           <w:tblHeader/>
         </w:trPr>
@@ -8771,12 +8659,6 @@
         </w:tc>
       </w:tr>
       <w:tr>
-        <w:tblPrEx>
-          <w:tblCellMar>
-            <w:top w:w="0" w:type="dxa"/>
-            <w:bottom w:w="0" w:type="dxa"/>
-          </w:tblCellMar>
-        </w:tblPrEx>
         <w:tc>
           <w:tcPr>
             <w:tcW w:w="3500" w:type="dxa"/>
@@ -8934,12 +8816,6 @@
         </w:tc>
       </w:tr>
       <w:tr>
-        <w:tblPrEx>
-          <w:tblCellMar>
-            <w:top w:w="0" w:type="dxa"/>
-            <w:bottom w:w="0" w:type="dxa"/>
-          </w:tblCellMar>
-        </w:tblPrEx>
         <w:tc>
           <w:tcPr>
             <w:tcW w:w="3500" w:type="dxa"/>

</xml_diff>